<commit_message>
Add .gitignore, update whitepaper, remove old character design doc
- Add .gitignore to exclude generated images, LoRA weights, OS files, and Python cache
- Update Synthia whitepaper
- Remove deprecated Aria character design doc (superseded by config.yaml persona definition)

Co-Authored-By: Claude Opus 4.6 (1M context) <noreply@anthropic.com>
</commit_message>
<xml_diff>
--- a/brand/docs/Synthia_Whitepaper.docx
+++ b/brand/docs/Synthia_Whitepaper.docx
@@ -117,7 +117,7 @@
           <w:sz w:val="20"/>
           <w:szCs w:val="20"/>
         </w:rPr>
-        <w:t xml:space="preserve">Version 3.0  |  March 2026</w:t>
+        <w:t xml:space="preserve">Version 3.1  |  March 2026</w:t>
       </w:r>
     </w:p>
     <w:p>
@@ -254,7 +254,7 @@
           <w:sz w:val="20"/>
           <w:szCs w:val="20"/>
         </w:rPr>
-        <w:t xml:space="preserve">A multi-model AI pipeline generates all content: fine-tuned Stable Diffusion with LoRA training and IP-Adapter for consistent persona appearance across hundreds of images; uncensored open-source models for adult content generation; Stable Video Diffusion and talking-head models for video; XTTS/ElevenLabs for unique per-persona voices; and LLM-powered conversational AI (Claude/GPT) for in-character DM interactions with per-subscriber memory. Automated scheduling, posting, and content management handle the operational layer. A 4-tier moderation stack ensures all content meets platform policies and legal requirements.</w:t>
+        <w:t xml:space="preserve">A multi-model AI pipeline generates all content: fine-tuned Stable Diffusion with LoRA training and IP-Adapter for consistent persona appearance across hundreds of images; uncensored open-source models for adult content generation; Wan 2.2 (open-source diffusion transformer) with NSFW fine-tunes for image-to-video and text-to-video, extended to arbitrary length via SVI 2.0 Pro; XTTS/ElevenLabs for unique per-persona voices; and LLM-powered conversational AI (Claude/GPT) for in-character DM interactions with per-subscriber memory. Automated scheduling, posting, and content management handle the operational layer. A 4-tier moderation stack ensures all content meets platform policies and legal requirements.</w:t>
       </w:r>
     </w:p>
     <w:p>
@@ -3976,7 +3976,7 @@
           <w:sz w:val="22"/>
           <w:szCs w:val="22"/>
         </w:rPr>
-        <w:t xml:space="preserve">AI video is the fastest-evolving frontier. Our strategy is to start with established techniques and integrate newer models as they mature:</w:t>
+        <w:t xml:space="preserve">AI video generation has matured rapidly. Open-source diffusion transformer models now produce cinematic-quality video from a single image, and community NSFW fine-tunes make this viable for adult content from day one. Our pipeline centres on the Wan 2.2 family (open-source, self-hosted, no content filters) running inside ComfyUI—the same orchestration layer used for our image pipeline:</w:t>
       </w:r>
     </w:p>
     <w:tbl>
@@ -4182,7 +4182,7 @@
                 <w:sz w:val="20"/>
                 <w:szCs w:val="20"/>
               </w:rPr>
-              <w:t xml:space="preserve">Stable Video Diffusion / Runway Gen-3</w:t>
+              <w:t xml:space="preserve">Wan 2.2 Remix NSFW (I2V)</w:t>
             </w:r>
           </w:p>
         </w:tc>
@@ -4240,7 +4240,7 @@
                 <w:sz w:val="20"/>
                 <w:szCs w:val="20"/>
               </w:rPr>
-              <w:t xml:space="preserve">Short clips from hero images</w:t>
+              <w:t xml:space="preserve">5–15s clips from LoRA hero images; SFW + NSFW</w:t>
             </w:r>
           </w:p>
         </w:tc>
@@ -4271,7 +4271,7 @@
                 <w:sz w:val="20"/>
                 <w:szCs w:val="20"/>
               </w:rPr>
-              <w:t xml:space="preserve">Talking Head</w:t>
+              <w:t xml:space="preserve">Long-Form Extension</w:t>
             </w:r>
           </w:p>
         </w:tc>
@@ -4300,7 +4300,7 @@
                 <w:sz w:val="20"/>
                 <w:szCs w:val="20"/>
               </w:rPr>
-              <w:t xml:space="preserve">SadTalker / LivePortrait</w:t>
+              <w:t xml:space="preserve">SVI 2.0 Pro (Stable Video Infinity)</w:t>
             </w:r>
           </w:p>
         </w:tc>
@@ -4329,7 +4329,7 @@
                 <w:sz w:val="20"/>
                 <w:szCs w:val="20"/>
               </w:rPr>
-              <w:t xml:space="preserve">Medium-High</w:t>
+              <w:t xml:space="preserve">High</w:t>
             </w:r>
           </w:p>
         </w:tc>
@@ -4358,7 +4358,7 @@
                 <w:sz w:val="20"/>
                 <w:szCs w:val="20"/>
               </w:rPr>
-              <w:t xml:space="preserve">Audio messages with lip sync</w:t>
+              <w:t xml:space="preserve">30s–60s+ clips via error-recycled frame chaining; infinite length</w:t>
             </w:r>
           </w:p>
         </w:tc>
@@ -4389,7 +4389,7 @@
                 <w:sz w:val="20"/>
                 <w:szCs w:val="20"/>
               </w:rPr>
-              <w:t xml:space="preserve">Full Video Gen</w:t>
+              <w:t xml:space="preserve">Text-to-Video</w:t>
             </w:r>
           </w:p>
         </w:tc>
@@ -4418,7 +4418,7 @@
                 <w:sz w:val="20"/>
                 <w:szCs w:val="20"/>
               </w:rPr>
-              <w:t xml:space="preserve">Kling / Sora (when available)</w:t>
+              <w:t xml:space="preserve">Wan 2.2 Remix NSFW (T2V) / HunyuanVideo</w:t>
             </w:r>
           </w:p>
         </w:tc>
@@ -4476,7 +4476,7 @@
                 <w:sz w:val="20"/>
                 <w:szCs w:val="20"/>
               </w:rPr>
-              <w:t xml:space="preserve">Longer narrative content</w:t>
+              <w:t xml:space="preserve">Text-prompted scene generation; narrative content</w:t>
             </w:r>
           </w:p>
         </w:tc>
@@ -4617,7 +4617,7 @@
           <w:sz w:val="22"/>
           <w:szCs w:val="22"/>
         </w:rPr>
-        <w:t xml:space="preserve">Video content will initially be shorter-form (5–30 seconds) focusing on greetings, reactions, and lifestyle moments, scaling to longer content as generation quality improves.</w:t>
+        <w:t xml:space="preserve">The core workflow is: generate a hero image via the LoRA + IP-Adapter pipeline → feed it into Wan 2.2 Remix I2V for a 5–15 second clip → optionally extend via SVI 2.0 Pro for 30–60+ second videos. All models run in ComfyUI on the same self-hosted GPU infrastructure used for image generation. Wan 2.2’s 5B model runs on 24GB VRAM (RTX 4090); the 14B model requires 48–80GB (A100). FP8 quantised variants enable 720p on 24GB hardware for MVP use. Video content at launch will range from 5–30 seconds (lifestyle clips, greetings, teases) scaling to 60+ seconds as SVI 2.0 Pro workflows mature.</w:t>
       </w:r>
     </w:p>
     <w:p>
@@ -6662,7 +6662,7 @@
           <w:sz w:val="22"/>
           <w:szCs w:val="22"/>
         </w:rPr>
-        <w:t xml:space="preserve">NSFW video is the most technically challenging and emerging area. Our phased approach:</w:t>
+        <w:t xml:space="preserve">NSFW video is now technically viable at launch quality thanks to the Wan 2.2 Remix NSFW fine-tune, which is purpose-built for uncensored image-to-video generation and runs entirely self-hosted with no content restrictions. This eliminates the need for the phased pseudo-video approach originally planned. Our updated approach:</w:t>
       </w:r>
     </w:p>
     <w:p>
@@ -6679,7 +6679,7 @@
           <w:sz w:val="24"/>
           <w:szCs w:val="24"/>
         </w:rPr>
-        <w:t xml:space="preserve">Phase 1 (Launch): Pseudo-Video</w:t>
+        <w:t xml:space="preserve">Phase 1 (Launch): Wan 2.2 NSFW Image-to-Video</w:t>
       </w:r>
     </w:p>
     <w:p>
@@ -6700,16 +6700,16 @@
           <w:sz w:val="22"/>
           <w:szCs w:val="22"/>
         </w:rPr>
-        <w:t xml:space="preserve">Animated Slideshows: </w:t>
-      </w:r>
-      <w:r>
-        <w:rPr>
-          <w:rFonts w:ascii="Arial" w:cs="Arial" w:eastAsia="Arial" w:hAnsi="Arial"/>
-          <w:color w:val="333333"/>
-          <w:sz w:val="22"/>
-          <w:szCs w:val="22"/>
-        </w:rPr>
-        <w:t xml:space="preserve">High-quality image sets with smooth transitions, panning, and subtle zoom effects. Low technical complexity, high visual appeal.</w:t>
+        <w:t xml:space="preserve">Wan 2.2 Remix NSFW I2V: </w:t>
+      </w:r>
+      <w:r>
+        <w:rPr>
+          <w:rFonts w:ascii="Arial" w:cs="Arial" w:eastAsia="Arial" w:hAnsi="Arial"/>
+          <w:color w:val="333333"/>
+          <w:sz w:val="22"/>
+          <w:szCs w:val="22"/>
+        </w:rPr>
+        <w:t xml:space="preserve">Generate 5–15 second video clips directly from NSFW hero images produced by the LoRA pipeline. Runs in ComfyUI on the same RunPod GPU infrastructure. Produces cinematic-quality motion (hair, body movement, scene ambiance) at 480–720p on 24GB VRAM (RTX 4090). No content filters when self-hosted.</w:t>
       </w:r>
     </w:p>
     <w:p>
@@ -6730,16 +6730,16 @@
           <w:sz w:val="22"/>
           <w:szCs w:val="22"/>
         </w:rPr>
-        <w:t xml:space="preserve">Talking Head NSFW: </w:t>
-      </w:r>
-      <w:r>
-        <w:rPr>
-          <w:rFonts w:ascii="Arial" w:cs="Arial" w:eastAsia="Arial" w:hAnsi="Arial"/>
-          <w:color w:val="333333"/>
-          <w:sz w:val="22"/>
-          <w:szCs w:val="22"/>
-        </w:rPr>
-        <w:t xml:space="preserve">SadTalker/LivePortrait applied to NSFW imagery for “video message” content. The persona speaks to camera with lip-synced audio.</w:t>
+        <w:t xml:space="preserve">SVI 2.0 Pro Extension: </w:t>
+      </w:r>
+      <w:r>
+        <w:rPr>
+          <w:rFonts w:ascii="Arial" w:cs="Arial" w:eastAsia="Arial" w:hAnsi="Arial"/>
+          <w:color w:val="333333"/>
+          <w:sz w:val="22"/>
+          <w:szCs w:val="22"/>
+        </w:rPr>
+        <w:t xml:space="preserve">Stable Video Infinity 2.0 Pro LoRA wraps Wan 2.2 to enable infinite-length video generation by recycling frames with error correction. Extends 5–15 second I2V clips to 30–60+ seconds with coherent motion and no ping-pong artefacts. This enables full-length PPV video content at launch rather than as a future phase.</w:t>
       </w:r>
     </w:p>
     <w:p>
@@ -6756,7 +6756,7 @@
           <w:sz w:val="24"/>
           <w:szCs w:val="24"/>
         </w:rPr>
-        <w:t xml:space="preserve">Phase 2 (Months 6–12): Early AI Video</w:t>
+        <w:t xml:space="preserve">Phase 2 (Months 3–6): Text-to-Video + Audio Overlay</w:t>
       </w:r>
     </w:p>
     <w:p>
@@ -6777,16 +6777,16 @@
           <w:sz w:val="22"/>
           <w:szCs w:val="22"/>
         </w:rPr>
-        <w:t xml:space="preserve">Image-to-Video: </w:t>
-      </w:r>
-      <w:r>
-        <w:rPr>
-          <w:rFonts w:ascii="Arial" w:cs="Arial" w:eastAsia="Arial" w:hAnsi="Arial"/>
-          <w:color w:val="333333"/>
-          <w:sz w:val="22"/>
-          <w:szCs w:val="22"/>
-        </w:rPr>
-        <w:t xml:space="preserve">Stable Video Diffusion and emerging uncensored video models to create 3–5 second clips from static images (hair moving, subtle body movement, scene ambiance).</w:t>
+        <w:t xml:space="preserve">Text-to-Video NSFW: </w:t>
+      </w:r>
+      <w:r>
+        <w:rPr>
+          <w:rFonts w:ascii="Arial" w:cs="Arial" w:eastAsia="Arial" w:hAnsi="Arial"/>
+          <w:color w:val="333333"/>
+          <w:sz w:val="22"/>
+          <w:szCs w:val="22"/>
+        </w:rPr>
+        <w:t xml:space="preserve">Wan 2.2 Remix T2V for generating scene-based video from text prompts alone (no source image required). Enables scenario-based NSFW video content at scale for premium PPV sets.</w:t>
       </w:r>
     </w:p>
     <w:p>
@@ -6807,16 +6807,16 @@
           <w:sz w:val="22"/>
           <w:szCs w:val="22"/>
         </w:rPr>
-        <w:t xml:space="preserve">AnimateDiff: </w:t>
-      </w:r>
-      <w:r>
-        <w:rPr>
-          <w:rFonts w:ascii="Arial" w:cs="Arial" w:eastAsia="Arial" w:hAnsi="Arial"/>
-          <w:color w:val="333333"/>
-          <w:sz w:val="22"/>
-          <w:szCs w:val="22"/>
-        </w:rPr>
-        <w:t xml:space="preserve">Motion modules applied to SDXL-generated frames for short animated sequences.</w:t>
+        <w:t xml:space="preserve">Audio Overlay: </w:t>
+      </w:r>
+      <w:r>
+        <w:rPr>
+          <w:rFonts w:ascii="Arial" w:cs="Arial" w:eastAsia="Arial" w:hAnsi="Arial"/>
+          <w:color w:val="333333"/>
+          <w:sz w:val="22"/>
+          <w:szCs w:val="22"/>
+        </w:rPr>
+        <w:t xml:space="preserve">Pair Wan 2.2 video output with ElevenLabs/XTTS voice audio for talking-head video messages and narrated content. Post-production pipeline combines video + audio + optional lip-sync adjustment.</w:t>
       </w:r>
     </w:p>
     <w:p>
@@ -6833,7 +6833,7 @@
           <w:sz w:val="24"/>
           <w:szCs w:val="24"/>
         </w:rPr>
-        <w:t xml:space="preserve">Phase 3 (Year 2+): Full AI Video</w:t>
+        <w:t xml:space="preserve">Phase 3 (Months 6+): Next-Gen Models + 1080p Production</w:t>
       </w:r>
     </w:p>
     <w:p>
@@ -6854,16 +6854,16 @@
           <w:sz w:val="22"/>
           <w:szCs w:val="22"/>
         </w:rPr>
-        <w:t xml:space="preserve">Emerging Models: </w:t>
-      </w:r>
-      <w:r>
-        <w:rPr>
-          <w:rFonts w:ascii="Arial" w:cs="Arial" w:eastAsia="Arial" w:hAnsi="Arial"/>
-          <w:color w:val="333333"/>
-          <w:sz w:val="22"/>
-          <w:szCs w:val="22"/>
-        </w:rPr>
-        <w:t xml:space="preserve">As uncensored text-to-video models mature (the space is evolving rapidly), integrate longer-form generation capabilities.</w:t>
+        <w:t xml:space="preserve">Next-Gen Models: </w:t>
+      </w:r>
+      <w:r>
+        <w:rPr>
+          <w:rFonts w:ascii="Arial" w:cs="Arial" w:eastAsia="Arial" w:hAnsi="Arial"/>
+          <w:color w:val="333333"/>
+          <w:sz w:val="22"/>
+          <w:szCs w:val="22"/>
+        </w:rPr>
+        <w:t xml:space="preserve">Integrate Wan 2.6/2.7 and HunyuanVideo successors as they release. Move to A100 80GB for native 1080p generation without quantisation. Evaluate emerging LoRA-based video consistency models for persona-locked video generation (analogous to image LoRAs).</w:t>
       </w:r>
     </w:p>
     <w:p>
@@ -6893,7 +6893,7 @@
           <w:sz w:val="22"/>
           <w:szCs w:val="22"/>
         </w:rPr>
-        <w:t xml:space="preserve">Frame interpolation (RIFE), upscaling, and audio overlay to produce polished final video content.</w:t>
+        <w:t xml:space="preserve">Frame interpolation (RIFE), Real-ESRGAN video upscaling to 1080p, audio overlay, and optional face-fix passes for final polish. Full automated pipeline from image → video → audio → delivery.</w:t>
       </w:r>
     </w:p>
     <w:p>
@@ -7768,7 +7768,7 @@
                 <w:sz w:val="20"/>
                 <w:szCs w:val="20"/>
               </w:rPr>
-              <w:t xml:space="preserve">Video creation, talking heads, lip sync</w:t>
+              <w:t xml:space="preserve">Video creation (Wan 2.2 I2V/T2V, SVI 2.0 Pro), upscaling, audio overlay</w:t>
             </w:r>
           </w:p>
         </w:tc>
@@ -12307,7 +12307,7 @@
           <w:sz w:val="22"/>
           <w:szCs w:val="22"/>
         </w:rPr>
-        <w:t xml:space="preserve">Voice and video content pipelines online (AnimateDiff pseudo-video, XTTS voice notes).</w:t>
+        <w:t xml:space="preserve">Voice and video content pipelines online (Wan 2.2 Remix NSFW I2V + SVI 2.0 Pro for video, XTTS/ElevenLabs for voice notes).</w:t>
       </w:r>
     </w:p>
     <w:p>

</xml_diff>